<commit_message>
Sprint 00-15: INNER JOIN foundation and end-to-end integration
Add JOIN parsing, JoinExecutor, qualified column handling, QueryExecutor wiring, integration tests, README update and Developer Notes 00-15.
</commit_message>
<xml_diff>
--- a/docs/Developer Notes/YEKDB_Developer_Notes_00-14.docx
+++ b/docs/Developer Notes/YEKDB_Developer_Notes_00-14.docx
@@ -23,9 +23,10 @@
         <w:tblLook w:val="04A0" w:firstRow="1" w:lastRow="0" w:firstColumn="1" w:lastColumn="0" w:noHBand="0" w:noVBand="1"/>
       </w:tblPr>
       <w:tblGrid>
-        <w:gridCol w:w="108"/>
+        <w:gridCol w:w="132"/>
         <w:gridCol w:w="4855"/>
-        <w:gridCol w:w="4963"/>
+        <w:gridCol w:w="107"/>
+        <w:gridCol w:w="4856"/>
         <w:gridCol w:w="105"/>
       </w:tblGrid>
       <w:tr>
@@ -36,24 +37,20 @@
         </w:trPr>
         <w:tc>
           <w:tcPr>
-            <w:tcW w:w="4963" w:type="dxa"/>
+            <w:tcW w:w="4987" w:type="dxa"/>
             <w:gridSpan w:val="2"/>
             <w:shd w:val="clear" w:color="auto" w:fill="D9EAF7"/>
           </w:tcPr>
           <w:p>
             <w:r>
-              <w:t xml:space="preserve">Ad ve </w:t>
+              <w:t>Ad ve Soyadı</w:t>
             </w:r>
-            <w:proofErr w:type="spellStart"/>
-            <w:r>
-              <w:t>Soyadı</w:t>
-            </w:r>
-            <w:proofErr w:type="spellEnd"/>
           </w:p>
         </w:tc>
         <w:tc>
           <w:tcPr>
             <w:tcW w:w="4963" w:type="dxa"/>
+            <w:gridSpan w:val="2"/>
           </w:tcPr>
           <w:p>
             <w:r>
@@ -70,36 +67,25 @@
         </w:trPr>
         <w:tc>
           <w:tcPr>
-            <w:tcW w:w="4963" w:type="dxa"/>
+            <w:tcW w:w="4987" w:type="dxa"/>
             <w:gridSpan w:val="2"/>
             <w:shd w:val="clear" w:color="auto" w:fill="D9EAF7"/>
           </w:tcPr>
           <w:p>
-            <w:proofErr w:type="spellStart"/>
             <w:r>
               <w:t>Bölüm</w:t>
             </w:r>
-            <w:proofErr w:type="spellEnd"/>
           </w:p>
         </w:tc>
         <w:tc>
           <w:tcPr>
             <w:tcW w:w="4963" w:type="dxa"/>
+            <w:gridSpan w:val="2"/>
           </w:tcPr>
           <w:p>
-            <w:proofErr w:type="spellStart"/>
             <w:r>
-              <w:t>Bilgisayar</w:t>
+              <w:t>Bilgisayar Mühendisliği</w:t>
             </w:r>
-            <w:proofErr w:type="spellEnd"/>
-            <w:r>
-              <w:t xml:space="preserve"> </w:t>
-            </w:r>
-            <w:proofErr w:type="spellStart"/>
-            <w:r>
-              <w:t>Mühendisliği</w:t>
-            </w:r>
-            <w:proofErr w:type="spellEnd"/>
           </w:p>
         </w:tc>
       </w:tr>
@@ -111,29 +97,20 @@
         </w:trPr>
         <w:tc>
           <w:tcPr>
-            <w:tcW w:w="4963" w:type="dxa"/>
+            <w:tcW w:w="4987" w:type="dxa"/>
             <w:gridSpan w:val="2"/>
             <w:shd w:val="clear" w:color="auto" w:fill="D9EAF7"/>
           </w:tcPr>
           <w:p>
-            <w:proofErr w:type="spellStart"/>
             <w:r>
-              <w:t>Proje</w:t>
+              <w:t>Proje Konusu</w:t>
             </w:r>
-            <w:proofErr w:type="spellEnd"/>
-            <w:r>
-              <w:t xml:space="preserve"> </w:t>
-            </w:r>
-            <w:proofErr w:type="spellStart"/>
-            <w:r>
-              <w:t>Konusu</w:t>
-            </w:r>
-            <w:proofErr w:type="spellEnd"/>
           </w:p>
         </w:tc>
         <w:tc>
           <w:tcPr>
             <w:tcW w:w="4963" w:type="dxa"/>
+            <w:gridSpan w:val="2"/>
           </w:tcPr>
           <w:p>
             <w:r>
@@ -150,21 +127,20 @@
         </w:trPr>
         <w:tc>
           <w:tcPr>
-            <w:tcW w:w="4963" w:type="dxa"/>
+            <w:tcW w:w="4987" w:type="dxa"/>
             <w:gridSpan w:val="2"/>
             <w:shd w:val="clear" w:color="auto" w:fill="D9EAF7"/>
           </w:tcPr>
           <w:p>
-            <w:proofErr w:type="spellStart"/>
             <w:r>
               <w:t>Yapılanlar</w:t>
             </w:r>
-            <w:proofErr w:type="spellEnd"/>
           </w:p>
         </w:tc>
         <w:tc>
           <w:tcPr>
             <w:tcW w:w="4963" w:type="dxa"/>
+            <w:gridSpan w:val="2"/>
           </w:tcPr>
           <w:p>
             <w:pPr>
@@ -173,7 +149,12 @@
               </w:rPr>
             </w:pPr>
             <w:r>
-              <w:t>CRUD Mutation Engine – INSERT, UPDATE ve DELETE</w:t>
+              <w:rPr>
+                <w:b/>
+                <w:bCs/>
+                <w:lang w:val="tr-TR"/>
+              </w:rPr>
+              <w:t>Advanced SELECT Query Engine</w:t>
             </w:r>
           </w:p>
         </w:tc>
@@ -181,31 +162,28 @@
       <w:tr>
         <w:tblPrEx>
           <w:jc w:val="left"/>
+          <w:tblInd w:w="-24" w:type="dxa"/>
         </w:tblPrEx>
         <w:trPr>
           <w:gridBefore w:val="1"/>
-          <w:wBefore w:w="108" w:type="dxa"/>
+          <w:wBefore w:w="132" w:type="dxa"/>
         </w:trPr>
         <w:tc>
           <w:tcPr>
-            <w:tcW w:w="4855" w:type="dxa"/>
+            <w:tcW w:w="4962" w:type="dxa"/>
+            <w:gridSpan w:val="2"/>
             <w:shd w:val="clear" w:color="auto" w:fill="DAEEF3" w:themeFill="accent5" w:themeFillTint="33"/>
             <w:hideMark/>
           </w:tcPr>
           <w:p>
-            <w:proofErr w:type="spellStart"/>
             <w:r>
-              <w:t>Doküman</w:t>
-            </w:r>
-            <w:proofErr w:type="spellEnd"/>
-            <w:r>
-              <w:t xml:space="preserve"> Kodu</w:t>
+              <w:t>Doküman Kodu</w:t>
             </w:r>
           </w:p>
         </w:tc>
         <w:tc>
           <w:tcPr>
-            <w:tcW w:w="5068" w:type="dxa"/>
+            <w:tcW w:w="4961" w:type="dxa"/>
             <w:gridSpan w:val="2"/>
             <w:hideMark/>
           </w:tcPr>
@@ -254,7 +232,15 @@
           <w:bCs/>
           <w:lang w:val="tr-TR"/>
         </w:rPr>
-        <w:t>13</w:t>
+        <w:t>1</w:t>
+      </w:r>
+      <w:r>
+        <w:rPr>
+          <w:b/>
+          <w:bCs/>
+          <w:lang w:val="tr-TR"/>
+        </w:rPr>
+        <w:t>4</w:t>
       </w:r>
     </w:p>
     <w:p>
@@ -265,12 +251,27 @@
           <w:bottom w:val="single" w:sz="4" w:space="1" w:color="auto"/>
           <w:right w:val="single" w:sz="4" w:space="4" w:color="auto"/>
         </w:pBdr>
-      </w:pPr>
-      <w:r>
         <w:rPr>
-          <w:i/>
+          <w:b/>
+          <w:bCs/>
+          <w:lang w:val="tr-TR"/>
         </w:rPr>
-        <w:t>Advanced WHERE Expression Engine</w:t>
+      </w:pPr>
+      <w:r>
+        <w:rPr>
+          <w:b/>
+          <w:bCs/>
+          <w:lang w:val="tr-TR"/>
+        </w:rPr>
+        <w:t>Advanced SELECT Query Engine</w:t>
+      </w:r>
+      <w:r>
+        <w:rPr>
+          <w:b/>
+          <w:bCs/>
+          <w:lang w:val="tr-TR"/>
+        </w:rPr>
+        <w:t xml:space="preserve"> </w:t>
       </w:r>
     </w:p>
     <w:p>
@@ -386,14 +387,12 @@
         </w:rPr>
         <w:t xml:space="preserve"> </w:t>
       </w:r>
-      <w:proofErr w:type="spellStart"/>
       <w:r>
         <w:rPr>
           <w:lang w:val="tr-TR"/>
         </w:rPr>
         <w:t>Ağutstos</w:t>
       </w:r>
-      <w:proofErr w:type="spellEnd"/>
       <w:r>
         <w:rPr>
           <w:lang w:val="tr-TR"/>
@@ -406,6 +405,19 @@
         <w:pStyle w:val="Balk1"/>
         <w:spacing w:before="200" w:after="80"/>
       </w:pPr>
+      <w:r>
+        <w:t>1. Sprint Özeti</w:t>
+      </w:r>
+    </w:p>
+    <w:p>
+      <w:r>
+        <w:t>Sprint 00-14 kapsamında YEKDB sorgu motorunun gelişmiş SELECT yetenekleri tamamlandı. Sprint 00-13 ile oluşturulan recursive expression engine korunarak predicate desteği genişletildi ve SELECT execution pipeline; GROUP BY, aggregate functions, HAVING, ORDER BY ve LIMIT/FETCH katmanlarıyla tamamlandı.</w:t>
+      </w:r>
+    </w:p>
+    <w:p>
+      <w:r>
+        <w:t>Ayrıca SQL metninden başlayan zincirde SelectStatement bilgisinin SelectMapper, SelectCommand ve QueryExecutor üzerinden kayıpsız biçimde SelectExecutor katmanına ulaşması sağlandı. Böylece gelişmiş SELECT özellikleri yalnızca bağımsız executor seviyesinde değil, gerçek SQL text → parser → command → executor akışı içerisinde doğrulandı.</w:t>
+      </w:r>
     </w:p>
     <w:p>
       <w:pPr>
@@ -413,25 +425,6 @@
         <w:spacing w:before="200" w:after="80"/>
       </w:pPr>
       <w:r>
-        <w:t>1. Sprint Özeti</w:t>
-      </w:r>
-    </w:p>
-    <w:p>
-      <w:r>
-        <w:t>Sprint 00-14 kapsamında YEKDB sorgu motorunun gelişmiş SELECT yetenekleri tamamlandı. Sprint 00-13 ile oluşturulan recursive expression engine korunarak predicate desteği genişletildi ve SELECT execution pipeline; GROUP BY, aggregate functions, HAVING, ORDER BY ve LIMIT/FETCH katmanlarıyla tamamlandı.</w:t>
-      </w:r>
-    </w:p>
-    <w:p>
-      <w:r>
-        <w:t>Ayrıca SQL metninden başlayan zincirde SelectStatement bilgisinin SelectMapper, SelectCommand ve QueryExecutor üzerinden kayıpsız biçimde SelectExecutor katmanına ulaşması sağlandı. Böylece gelişmiş SELECT özellikleri yalnızca bağımsız executor seviyesinde değil, gerçek SQL text → parser → command → executor akışı içerisinde doğrulandı.</w:t>
-      </w:r>
-    </w:p>
-    <w:p>
-      <w:pPr>
-        <w:pStyle w:val="Balk1"/>
-        <w:spacing w:before="200" w:after="80"/>
-      </w:pPr>
-      <w:r>
         <w:t>2. Sprint Hedefleri</w:t>
       </w:r>
     </w:p>
@@ -549,7 +542,6 @@
         <w:spacing w:after="40"/>
       </w:pPr>
       <w:r>
-        <w:lastRenderedPageBreak/>
         <w:t>SelectMapper / SelectCommand entegrasyonu</w:t>
       </w:r>
     </w:p>
@@ -577,6 +569,7 @@
         <w:spacing w:after="40"/>
       </w:pPr>
       <w:r>
+        <w:lastRenderedPageBreak/>
         <w:t>Final Maven doğrulaması</w:t>
       </w:r>
     </w:p>
@@ -1387,7 +1380,6 @@
         <w:spacing w:after="80"/>
       </w:pPr>
       <w:r>
-        <w:lastRenderedPageBreak/>
         <w:t>4.3 LIKE / ILIKE</w:t>
       </w:r>
     </w:p>
@@ -1407,6 +1399,9 @@
       </w:r>
       <w:r>
         <w:br/>
+      </w:r>
+      <w:r>
+        <w:lastRenderedPageBreak/>
         <w:t>name ILIKE 'a%'</w:t>
       </w:r>
       <w:r>
@@ -1613,7 +1608,6 @@
         <w:spacing w:before="200" w:after="80"/>
       </w:pPr>
       <w:r>
-        <w:lastRenderedPageBreak/>
         <w:t>8. GROUP BY</w:t>
       </w:r>
     </w:p>
@@ -1630,6 +1624,7 @@
         <w:ind w:left="317" w:right="173"/>
       </w:pPr>
       <w:r>
+        <w:lastRenderedPageBreak/>
         <w:t>SELECT department</w:t>
       </w:r>
       <w:r>
@@ -2011,7 +2006,6 @@
         <w:spacing w:before="200" w:after="80"/>
       </w:pPr>
       <w:r>
-        <w:lastRenderedPageBreak/>
         <w:t>12. SelectMapper ve SelectCommand</w:t>
       </w:r>
     </w:p>
@@ -2036,6 +2030,9 @@
       </w:r>
       <w:r>
         <w:br/>
+      </w:r>
+      <w:r>
+        <w:lastRenderedPageBreak/>
         <w:t>SelectMapper</w:t>
       </w:r>
       <w:r>
@@ -2235,7 +2232,6 @@
         <w:ind w:left="317" w:right="173"/>
       </w:pPr>
       <w:r>
-        <w:lastRenderedPageBreak/>
         <w:t>SELECT</w:t>
       </w:r>
       <w:r>
@@ -2264,6 +2260,9 @@
       </w:r>
       <w:r>
         <w:br/>
+      </w:r>
+      <w:r>
+        <w:lastRenderedPageBreak/>
         <w:t>ORDER BY employee_count DESC</w:t>
       </w:r>
       <w:r>
@@ -2512,7 +2511,6 @@
         <w:spacing w:before="200" w:after="80"/>
       </w:pPr>
       <w:r>
-        <w:lastRenderedPageBreak/>
         <w:t>18. Final Maven Verification</w:t>
       </w:r>
     </w:p>
@@ -2541,6 +2539,7 @@
     </w:p>
     <w:p>
       <w:r>
+        <w:lastRenderedPageBreak/>
         <w:t>Bu sonuç Sprint 00-14 değişikliklerinin önceki sprint fonksiyonlarını bozmadığını ve regression açısından sistemin kararlı kaldığını doğrulamaktadır.</w:t>
       </w:r>
     </w:p>
@@ -2727,9 +2726,6 @@
       </w:r>
       <w:r>
         <w:br/>
-      </w:r>
-      <w:r>
-        <w:lastRenderedPageBreak/>
         <w:t xml:space="preserve"> ├── Aggregate</w:t>
       </w:r>
       <w:r>
@@ -2763,6 +2759,7 @@
         <w:spacing w:before="200" w:after="80"/>
       </w:pPr>
       <w:r>
+        <w:lastRenderedPageBreak/>
         <w:t>21. Bilinen Sprint Sınırları</w:t>
       </w:r>
     </w:p>
@@ -3053,7 +3050,6 @@
         <w:rPr>
           <w:color w:val="548235"/>
         </w:rPr>
-        <w:lastRenderedPageBreak/>
         <w:t>✓ SelectCommand full statement preservation</w:t>
       </w:r>
     </w:p>
@@ -3138,6 +3134,7 @@
         <w:rPr>
           <w:color w:val="548235"/>
         </w:rPr>
+        <w:lastRenderedPageBreak/>
         <w:t>✓ README update</w:t>
       </w:r>
     </w:p>
@@ -4064,7 +4061,6 @@
   <w:style w:type="character" w:default="1" w:styleId="VarsaylanParagrafYazTipi">
     <w:name w:val="Default Paragraph Font"/>
     <w:uiPriority w:val="1"/>
-    <w:semiHidden/>
     <w:unhideWhenUsed/>
   </w:style>
   <w:style w:type="table" w:default="1" w:styleId="NormalTablo">

</xml_diff>